<commit_message>
Wave 7 — governance: LESSONS #32 + enforcement anchor + DECISIONS ledger + regenerated samples
- LESSONS.md صفّ ٣٢: «إصلاحُ المحرّك لا تحرير التقرير» — كل عائلة عيبٍ تحريريّ
  صارت قاعدةَ عقدٍ + إنفاذَ عرضٍ حتميّ + قفلًا على مدوّنة اليمن الإنتاجية الشكل.
- test_lessons_enforcement.py: مرساة البند ٣٢ (٧ ملفات مصدر/اختبار).
- DECISIONS.md: سجلّ الترقية DONE-with-artifact/NOT DONE لكل بند (هرمتي؛
  التوليد الحيّ end-to-end بوابة المالك المدفوعة، والمسار الصوري مؤجَّل).
- samples/ أُعيد توليدها (§10.6) — تحمل «شرطا قلب الحكم» الجديد.

Co-Authored-By: Claude Opus 4.8 <noreply@anthropic.com>
Claude-Session: https://claude.ai/code/session_01K3WcR8T5E2jvMBWaGjh3bz
</commit_message>
<xml_diff>
--- a/samples/research_report_latest.docx
+++ b/samples/research_report_latest.docx
@@ -4923,6 +4923,34 @@
     </w:p>
     <w:p>
       <w:pPr>
+        <w:pStyle w:val="Heading2"/>
+        <w:bidi/>
+        <w:jc w:val="start"/>
+      </w:pPr>
+      <w:r>
+        <w:rPr>
+          <w:rFonts w:ascii="IBM Plex Sans Arabic" w:hAnsi="IBM Plex Sans Arabic" w:cs="IBM Plex Sans Arabic"/>
+          <w:rtl/>
+        </w:rPr>
+        <w:t>شرطا قلب الحكم</w:t>
+      </w:r>
+    </w:p>
+    <w:p>
+      <w:pPr>
+        <w:pStyle w:val="ListBullet"/>
+        <w:bidi/>
+        <w:jc w:val="start"/>
+      </w:pPr>
+      <w:r>
+        <w:rPr>
+          <w:rFonts w:ascii="IBM Plex Sans Arabic" w:hAnsi="IBM Plex Sans Arabic" w:cs="IBM Plex Sans Arabic"/>
+          <w:rtl/>
+        </w:rPr>
+        <w:t>التعاقد مع موزّع محلي مؤكَّد بالاسم في إسبانيا — ✓ محقَّق؛ يُغلَق عبر: خدمة تحقّق جهات الاتصال المدفوعة ثم عقد موزّع</w:t>
+      </w:r>
+    </w:p>
+    <w:p>
+      <w:pPr>
         <w:pStyle w:val="IntenseQuote"/>
         <w:bidi/>
         <w:jc w:val="start"/>

</xml_diff>

<commit_message>
Report Quality Engine Upgrade — Yemen editorial audit → permanent engine fixes (#130)
Converts the owner's editorial audit of the Yemen peanut-butter report into permanent engine fixes across 6 waves: HS pre-flight confirmation gate + flagged-HS reframe/confidence-cap; provenance-based stale-data disclosure (structured DataPoint.data_year, LESSON #33); seasonality-gap closure + weak-trends broadening; per-row price reasons + HHI context-only; single HS methodology note + section order; professional-tone/anti-alarmist + sentence-length; structured flip conditions + exec-summary cap. LESSONS #32/#33 + enforcement anchors + regression guards. Hermetic suite green.
</commit_message>
<xml_diff>
--- a/samples/research_report_latest.docx
+++ b/samples/research_report_latest.docx
@@ -403,7 +403,7 @@
                 <w:rFonts w:ascii="IBM Plex Sans Arabic" w:hAnsi="IBM Plex Sans Arabic" w:cs="IBM Plex Sans Arabic"/>
                 <w:rtl/>
               </w:rPr>
-              <w:t>2026-07-19</w:t>
+              <w:t>2026-07-20</w:t>
             </w:r>
           </w:p>
         </w:tc>
@@ -4923,6 +4923,34 @@
     </w:p>
     <w:p>
       <w:pPr>
+        <w:pStyle w:val="Heading2"/>
+        <w:bidi/>
+        <w:jc w:val="start"/>
+      </w:pPr>
+      <w:r>
+        <w:rPr>
+          <w:rFonts w:ascii="IBM Plex Sans Arabic" w:hAnsi="IBM Plex Sans Arabic" w:cs="IBM Plex Sans Arabic"/>
+          <w:rtl/>
+        </w:rPr>
+        <w:t>شرطا قلب الحكم</w:t>
+      </w:r>
+    </w:p>
+    <w:p>
+      <w:pPr>
+        <w:pStyle w:val="ListBullet"/>
+        <w:bidi/>
+        <w:jc w:val="start"/>
+      </w:pPr>
+      <w:r>
+        <w:rPr>
+          <w:rFonts w:ascii="IBM Plex Sans Arabic" w:hAnsi="IBM Plex Sans Arabic" w:cs="IBM Plex Sans Arabic"/>
+          <w:rtl/>
+        </w:rPr>
+        <w:t>التعاقد مع موزّع محلي مؤكَّد بالاسم في إسبانيا — ✓ محقَّق؛ يُغلَق عبر: خدمة تحقّق جهات الاتصال المدفوعة ثم عقد موزّع</w:t>
+      </w:r>
+    </w:p>
+    <w:p>
+      <w:pPr>
         <w:pStyle w:val="IntenseQuote"/>
         <w:bidi/>
         <w:jc w:val="start"/>

</xml_diff>